<commit_message>
New choosed tool for MFO
</commit_message>
<xml_diff>
--- a/BFA/Reviews/BÁO CÁO TẬP HỢP VÀ ĐÁNH GIÁ CHI TIẾT CÁC FILE FRONTEND (FE) MFO.docx
+++ b/BFA/Reviews/BÁO CÁO TẬP HỢP VÀ ĐÁNH GIÁ CHI TIẾT CÁC FILE FRONTEND (FE) MFO.docx
@@ -6,6 +6,21 @@
       <w:pPr>
         <w:pStyle w:val="Heading1"/>
         <w:spacing w:after="200"/>
+        <w:rPr>
+          <w:lang w:val="vi-VN"/>
+        </w:rPr>
+      </w:pPr>
+      <w:r>
+        <w:rPr>
+          <w:lang w:val="vi-VN"/>
+        </w:rPr>
+        <w:t>(Báo cáo không tin cậy)</w:t>
+      </w:r>
+    </w:p>
+    <w:p>
+      <w:pPr>
+        <w:pStyle w:val="Heading1"/>
+        <w:spacing w:after="200"/>
       </w:pPr>
       <w:r>
         <w:t>BÁO CÁO TẬP HỢP VÀ ĐÁNH GIÁ CHI TIẾT CÁC FILE FRONTEND (FE) MFO</w:t>
@@ -460,6 +475,9 @@
       </w:r>
       <w:r>
         <w:br/>
+      </w:r>
+      <w:r>
+        <w:lastRenderedPageBreak/>
         <w:t xml:space="preserve">| </w:t>
       </w:r>
       <w:r>
@@ -484,9 +502,6 @@
       </w:r>
       <w:r>
         <w:br/>
-      </w:r>
-      <w:r>
-        <w:lastRenderedPageBreak/>
         <w:t xml:space="preserve">| </w:t>
       </w:r>
       <w:r>
@@ -965,6 +980,7 @@
           <w:b/>
           <w:bCs/>
         </w:rPr>
+        <w:lastRenderedPageBreak/>
         <w:t>Nhiệm vụ:</w:t>
       </w:r>
     </w:p>
@@ -978,7 +994,6 @@
         <w:spacing w:after="100"/>
       </w:pPr>
       <w:r>
-        <w:lastRenderedPageBreak/>
         <w:t>Khởi tạo và đồng bộ 5 dòng đời (</w:t>
       </w:r>
       <w:r>
@@ -1834,6 +1849,7 @@
         <w:spacing w:after="100"/>
       </w:pPr>
       <w:r>
+        <w:lastRenderedPageBreak/>
         <w:t>Điều hướng ngay sang trang Workbench chuyên dụng (</w:t>
       </w:r>
       <w:r>
@@ -1852,7 +1868,6 @@
         <w:spacing w:after="200"/>
       </w:pPr>
       <w:r>
-        <w:lastRenderedPageBreak/>
         <w:t xml:space="preserve"> </w:t>
       </w:r>
     </w:p>
@@ -2500,6 +2515,7 @@
         <w:spacing w:after="200"/>
       </w:pPr>
       <w:r>
+        <w:lastRenderedPageBreak/>
         <w:t xml:space="preserve"> </w:t>
       </w:r>
     </w:p>
@@ -2509,7 +2525,6 @@
         <w:spacing w:after="200"/>
       </w:pPr>
       <w:r>
-        <w:lastRenderedPageBreak/>
         <w:t xml:space="preserve">3. FE-03: </w:t>
       </w:r>
       <w:r>
@@ -3123,6 +3138,7 @@
         <w:spacing w:after="200"/>
       </w:pPr>
       <w:r>
+        <w:lastRenderedPageBreak/>
         <w:t xml:space="preserve"> </w:t>
       </w:r>
     </w:p>
@@ -3132,7 +3148,6 @@
         <w:spacing w:after="200"/>
       </w:pPr>
       <w:r>
-        <w:lastRenderedPageBreak/>
         <w:t>1) Nội dung</w:t>
       </w:r>
     </w:p>
@@ -3622,6 +3637,7 @@
           <w:b/>
           <w:bCs/>
         </w:rPr>
+        <w:lastRenderedPageBreak/>
         <w:t>Chức năng:</w:t>
       </w:r>
       <w:r>
@@ -3655,7 +3671,6 @@
         <w:spacing w:after="100"/>
       </w:pPr>
       <w:r>
-        <w:lastRenderedPageBreak/>
         <w:t xml:space="preserve">Tải đồng thời thông tin cá nhân và thông tin cha/mẹ đẻ bằng </w:t>
       </w:r>
       <w:r>
@@ -4144,6 +4159,7 @@
         <w:spacing w:after="200"/>
       </w:pPr>
       <w:r>
+        <w:lastRenderedPageBreak/>
         <w:t>2) Sơ đồ cấu trúc dữ liệu nháp</w:t>
       </w:r>
     </w:p>
@@ -4168,7 +4184,6 @@
           <w:sz w:val="20"/>
           <w:szCs w:val="20"/>
         </w:rPr>
-        <w:lastRenderedPageBreak/>
         <w:t xml:space="preserve">         </w:t>
       </w:r>
       <w:r>
@@ -4572,6 +4587,7 @@
         <w:spacing w:after="200"/>
       </w:pPr>
       <w:r>
+        <w:lastRenderedPageBreak/>
         <w:t xml:space="preserve"> </w:t>
       </w:r>
     </w:p>
@@ -4589,7 +4605,6 @@
         <w:spacing w:after="200"/>
       </w:pPr>
       <w:r>
-        <w:lastRenderedPageBreak/>
         <w:t xml:space="preserve"> </w:t>
       </w:r>
     </w:p>
@@ -5131,6 +5146,7 @@
         <w:spacing w:after="200"/>
       </w:pPr>
       <w:r>
+        <w:lastRenderedPageBreak/>
         <w:t xml:space="preserve"> </w:t>
       </w:r>
     </w:p>
@@ -5234,412 +5250,412 @@
           <w:b/>
           <w:bCs/>
         </w:rPr>
+        <w:t>Lọc bỏ mã UUID thô:</w:t>
+      </w:r>
+      <w:r>
+        <w:t xml:space="preserve"> Hàm </w:t>
+      </w:r>
+      <w:r>
+        <w:rPr>
+          <w:rFonts w:ascii="Courier New" w:eastAsia="Courier New" w:hAnsi="Courier New" w:cs="Courier New"/>
+          <w:shd w:val="clear" w:color="auto" w:fill="F1F5F9"/>
+        </w:rPr>
+        <w:t>looksLikeCode()</w:t>
+      </w:r>
+      <w:r>
+        <w:t xml:space="preserve"> tự động nhận diện nếu tên trả về dạng mã hex UUID (</w:t>
+      </w:r>
+      <w:r>
+        <w:rPr>
+          <w:rFonts w:ascii="Courier New" w:eastAsia="Courier New" w:hAnsi="Courier New" w:cs="Courier New"/>
+          <w:shd w:val="clear" w:color="auto" w:fill="F1F5F9"/>
+        </w:rPr>
+        <w:t>/^[0-9a-f-]{16,}$/i</w:t>
+      </w:r>
+      <w:r>
+        <w:t>) để thay thế bằng danh xưng tự nhiên: "Đã chọn trên sổ Họ".</w:t>
+      </w:r>
+    </w:p>
+    <w:p>
+      <w:pPr>
+        <w:spacing w:after="200"/>
+      </w:pPr>
+      <w:r>
+        <w:t xml:space="preserve"> </w:t>
+      </w:r>
+    </w:p>
+    <w:p>
+      <w:pPr>
+        <w:pStyle w:val="Heading4"/>
+        <w:spacing w:after="200"/>
+      </w:pPr>
+      <w:r>
+        <w:t>3) Đánh giá chất lượng mã nguồn</w:t>
+      </w:r>
+    </w:p>
+    <w:p>
+      <w:pPr>
+        <w:spacing w:after="200"/>
+      </w:pPr>
+      <w:r>
+        <w:t xml:space="preserve"> </w:t>
+      </w:r>
+    </w:p>
+    <w:p>
+      <w:pPr>
+        <w:pStyle w:val="ListParagraph"/>
+        <w:numPr>
+          <w:ilvl w:val="0"/>
+          <w:numId w:val="2"/>
+        </w:numPr>
+        <w:spacing w:after="100"/>
+      </w:pPr>
+      <w:r>
+        <w:rPr>
+          <w:b/>
+          <w:bCs/>
+        </w:rPr>
+        <w:t>Ưu điểm:</w:t>
+      </w:r>
+      <w:r>
+        <w:t xml:space="preserve"> Giao diện Accordion rất gọn gàng, có nút nghe giọng đọc tóm tắt tiến độ phiếu cực kỳ thân thiện.</w:t>
+      </w:r>
+    </w:p>
+    <w:p>
+      <w:pPr>
+        <w:pStyle w:val="ListParagraph"/>
+        <w:numPr>
+          <w:ilvl w:val="0"/>
+          <w:numId w:val="2"/>
+        </w:numPr>
+        <w:spacing w:after="100"/>
+      </w:pPr>
+      <w:r>
+        <w:rPr>
+          <w:b/>
+          <w:bCs/>
+        </w:rPr>
+        <w:t>Lỗ hổng chết người:</w:t>
+      </w:r>
+    </w:p>
+    <w:p>
+      <w:pPr>
+        <w:pStyle w:val="ListParagraph"/>
+        <w:numPr>
+          <w:ilvl w:val="1"/>
+          <w:numId w:val="2"/>
+        </w:numPr>
+        <w:spacing w:after="100"/>
+      </w:pPr>
+      <w:r>
+        <w:rPr>
+          <w:b/>
+          <w:bCs/>
+        </w:rPr>
+        <w:t>Thiếu Entrypoint vào Workbench:</w:t>
+      </w:r>
+      <w:r>
+        <w:t xml:space="preserve"> Với các phiếu ở trạng thái </w:t>
+      </w:r>
+      <w:r>
+        <w:rPr>
+          <w:rFonts w:ascii="Courier New" w:eastAsia="Courier New" w:hAnsi="Courier New" w:cs="Courier New"/>
+          <w:shd w:val="clear" w:color="auto" w:fill="F1F5F9"/>
+        </w:rPr>
+        <w:t>UNDER_REVIEW</w:t>
+      </w:r>
+      <w:r>
+        <w:t xml:space="preserve"> (đã có tem </w:t>
+      </w:r>
+      <w:r>
+        <w:rPr>
+          <w:rFonts w:ascii="Courier New" w:eastAsia="Courier New" w:hAnsi="Courier New" w:cs="Courier New"/>
+          <w:shd w:val="clear" w:color="auto" w:fill="F1F5F9"/>
+        </w:rPr>
+        <w:t>plan_ok</w:t>
+      </w:r>
+      <w:r>
+        <w:t xml:space="preserve">), component này </w:t>
+      </w:r>
+      <w:r>
+        <w:rPr>
+          <w:b/>
+          <w:bCs/>
+        </w:rPr>
+        <w:t>không có nút bấm nào</w:t>
+      </w:r>
+      <w:r>
+        <w:t xml:space="preserve"> để dẫn người dùng vào trang làm việc (Workbench) để tạo thành viên! Người dùng bị kẹt lại ở màn hình xem trạng thái mà không biết làm sao để nhập người tiếp.</w:t>
+      </w:r>
+    </w:p>
+    <w:p>
+      <w:pPr>
+        <w:pStyle w:val="ListParagraph"/>
+        <w:numPr>
+          <w:ilvl w:val="0"/>
+          <w:numId w:val="2"/>
+        </w:numPr>
+        <w:spacing w:after="100"/>
+      </w:pPr>
+      <w:r>
+        <w:rPr>
+          <w:b/>
+          <w:bCs/>
+        </w:rPr>
+        <w:t>Hướng tối ưu:</w:t>
+      </w:r>
+      <w:r>
+        <w:t xml:space="preserve"> Bổ sung nút CTA lớn: "Vào Xưởng Kê Khai (Workbench)" khi </w:t>
+      </w:r>
+      <w:r>
+        <w:rPr>
+          <w:rFonts w:ascii="Courier New" w:eastAsia="Courier New" w:hAnsi="Courier New" w:cs="Courier New"/>
+          <w:shd w:val="clear" w:color="auto" w:fill="F1F5F9"/>
+        </w:rPr>
+        <w:t>ticket.payload.plan_ok === true</w:t>
+      </w:r>
+      <w:r>
+        <w:t>.</w:t>
+      </w:r>
+    </w:p>
+    <w:p>
+      <w:pPr>
+        <w:spacing w:after="200"/>
+      </w:pPr>
+      <w:r>
+        <w:t xml:space="preserve"> </w:t>
+      </w:r>
+    </w:p>
+    <w:p>
+      <w:pPr>
+        <w:pStyle w:val="Heading3"/>
+        <w:spacing w:after="200"/>
+      </w:pPr>
+      <w:r>
+        <w:t xml:space="preserve">9. FE-09: </w:t>
+      </w:r>
+      <w:r>
+        <w:rPr>
+          <w:rFonts w:ascii="Courier New" w:eastAsia="Courier New" w:hAnsi="Courier New" w:cs="Courier New"/>
+          <w:shd w:val="clear" w:color="auto" w:fill="F1F5F9"/>
+        </w:rPr>
+        <w:t>frontend/src/pages/OpHubPage.jsx</w:t>
+      </w:r>
+    </w:p>
+    <w:p>
+      <w:pPr>
+        <w:spacing w:after="200"/>
+      </w:pPr>
+      <w:r>
+        <w:t xml:space="preserve"> </w:t>
+      </w:r>
+    </w:p>
+    <w:p>
+      <w:pPr>
+        <w:pStyle w:val="Heading4"/>
+        <w:spacing w:after="200"/>
+      </w:pPr>
+      <w:r>
+        <w:t>1) Nội dung</w:t>
+      </w:r>
+    </w:p>
+    <w:p>
+      <w:pPr>
+        <w:spacing w:after="200"/>
+      </w:pPr>
+      <w:r>
+        <w:t xml:space="preserve"> </w:t>
+      </w:r>
+    </w:p>
+    <w:p>
+      <w:pPr>
+        <w:pStyle w:val="ListParagraph"/>
+        <w:numPr>
+          <w:ilvl w:val="0"/>
+          <w:numId w:val="2"/>
+        </w:numPr>
+        <w:spacing w:after="100"/>
+      </w:pPr>
+      <w:r>
+        <w:rPr>
+          <w:b/>
+          <w:bCs/>
+        </w:rPr>
+        <w:t>Chức năng:</w:t>
+      </w:r>
+      <w:r>
+        <w:t xml:space="preserve"> Cổng tác nghiệp chính (</w:t>
+      </w:r>
+      <w:r>
+        <w:rPr>
+          <w:rFonts w:ascii="Courier New" w:eastAsia="Courier New" w:hAnsi="Courier New" w:cs="Courier New"/>
+          <w:shd w:val="clear" w:color="auto" w:fill="F1F5F9"/>
+        </w:rPr>
+        <w:t>/op</w:t>
+      </w:r>
+      <w:r>
+        <w:t>) của thành viên đã đăng nhập (MWL).</w:t>
+      </w:r>
+    </w:p>
+    <w:p>
+      <w:pPr>
+        <w:pStyle w:val="ListParagraph"/>
+        <w:numPr>
+          <w:ilvl w:val="0"/>
+          <w:numId w:val="2"/>
+        </w:numPr>
+        <w:spacing w:after="100"/>
+      </w:pPr>
+      <w:r>
+        <w:rPr>
+          <w:b/>
+          <w:bCs/>
+        </w:rPr>
+        <w:t>Nhiệm vụ:</w:t>
+      </w:r>
+    </w:p>
+    <w:p>
+      <w:pPr>
+        <w:pStyle w:val="ListParagraph"/>
+        <w:numPr>
+          <w:ilvl w:val="1"/>
+          <w:numId w:val="2"/>
+        </w:numPr>
+        <w:spacing w:after="100"/>
+      </w:pPr>
+      <w:r>
+        <w:t xml:space="preserve">Nhúng component </w:t>
+      </w:r>
+      <w:r>
+        <w:rPr>
+          <w:rFonts w:ascii="Courier New" w:eastAsia="Courier New" w:hAnsi="Courier New" w:cs="Courier New"/>
+          <w:shd w:val="clear" w:color="auto" w:fill="F1F5F9"/>
+        </w:rPr>
+        <w:t>MyMfoPlans</w:t>
+      </w:r>
+      <w:r>
+        <w:t xml:space="preserve"> làm khu vực tác nghiệp ưu tiên trên cùng.</w:t>
+      </w:r>
+    </w:p>
+    <w:p>
+      <w:pPr>
+        <w:pStyle w:val="ListParagraph"/>
+        <w:numPr>
+          <w:ilvl w:val="1"/>
+          <w:numId w:val="2"/>
+        </w:numPr>
+        <w:spacing w:after="100"/>
+      </w:pPr>
+      <w:r>
+        <w:t>Điều phối các chức năng hồ sơ cá nhân: Họ tên, Ngày sinh, Địa chỉ, Tiểu sử, Thành tựu.</w:t>
+      </w:r>
+    </w:p>
+    <w:p>
+      <w:pPr>
+        <w:pStyle w:val="ListParagraph"/>
+        <w:numPr>
+          <w:ilvl w:val="1"/>
+          <w:numId w:val="2"/>
+        </w:numPr>
+        <w:spacing w:after="100"/>
+      </w:pPr>
+      <w:r>
+        <w:t xml:space="preserve">Bảo vệ trạng thái Onboarding: Chặn các tài khoản </w:t>
+      </w:r>
+      <w:r>
+        <w:rPr>
+          <w:rFonts w:ascii="Courier New" w:eastAsia="Courier New" w:hAnsi="Courier New" w:cs="Courier New"/>
+          <w:shd w:val="clear" w:color="auto" w:fill="F1F5F9"/>
+        </w:rPr>
+        <w:t>DU_BI</w:t>
+      </w:r>
+      <w:r>
+        <w:t xml:space="preserve"> chưa hoàn tất hồ sơ không được vào sâu hệ thống.</w:t>
+      </w:r>
+    </w:p>
+    <w:p>
+      <w:pPr>
+        <w:spacing w:after="200"/>
+      </w:pPr>
+      <w:r>
+        <w:t xml:space="preserve"> </w:t>
+      </w:r>
+    </w:p>
+    <w:p>
+      <w:pPr>
+        <w:pStyle w:val="Heading4"/>
+        <w:spacing w:after="200"/>
+      </w:pPr>
+      <w:r>
+        <w:t>2) Đánh giá chất lượng mã nguồn</w:t>
+      </w:r>
+    </w:p>
+    <w:p>
+      <w:pPr>
+        <w:spacing w:after="200"/>
+      </w:pPr>
+      <w:r>
+        <w:t xml:space="preserve"> </w:t>
+      </w:r>
+    </w:p>
+    <w:p>
+      <w:pPr>
+        <w:pStyle w:val="ListParagraph"/>
+        <w:numPr>
+          <w:ilvl w:val="0"/>
+          <w:numId w:val="2"/>
+        </w:numPr>
+        <w:spacing w:after="100"/>
+      </w:pPr>
+      <w:r>
+        <w:rPr>
+          <w:b/>
+          <w:bCs/>
+        </w:rPr>
+        <w:t>Ưu điểm:</w:t>
+      </w:r>
+      <w:r>
+        <w:t xml:space="preserve"> Tích hợp đa năng, kiểm soát phiên đăng nhập và định danh chi họ (</w:t>
+      </w:r>
+      <w:r>
+        <w:rPr>
+          <w:rFonts w:ascii="Courier New" w:eastAsia="Courier New" w:hAnsi="Courier New" w:cs="Courier New"/>
+          <w:shd w:val="clear" w:color="auto" w:fill="F1F5F9"/>
+        </w:rPr>
+        <w:t>resolveTenant</w:t>
+      </w:r>
+      <w:r>
+        <w:t>) rất chặt chẽ.</w:t>
+      </w:r>
+    </w:p>
+    <w:p>
+      <w:pPr>
+        <w:pStyle w:val="ListParagraph"/>
+        <w:numPr>
+          <w:ilvl w:val="0"/>
+          <w:numId w:val="2"/>
+        </w:numPr>
+        <w:spacing w:after="100"/>
+      </w:pPr>
+      <w:r>
+        <w:rPr>
+          <w:b/>
+          <w:bCs/>
+        </w:rPr>
+        <w:t>Điểm nghẽn liên quan đến MFO:</w:t>
+      </w:r>
+    </w:p>
+    <w:p>
+      <w:pPr>
+        <w:pStyle w:val="ListParagraph"/>
+        <w:numPr>
+          <w:ilvl w:val="1"/>
+          <w:numId w:val="2"/>
+        </w:numPr>
+        <w:spacing w:after="100"/>
+      </w:pPr>
+      <w:r>
         <w:lastRenderedPageBreak/>
-        <w:t>Lọc bỏ mã UUID thô:</w:t>
-      </w:r>
-      <w:r>
-        <w:t xml:space="preserve"> Hàm </w:t>
-      </w:r>
-      <w:r>
-        <w:rPr>
-          <w:rFonts w:ascii="Courier New" w:eastAsia="Courier New" w:hAnsi="Courier New" w:cs="Courier New"/>
-          <w:shd w:val="clear" w:color="auto" w:fill="F1F5F9"/>
-        </w:rPr>
-        <w:t>looksLikeCode()</w:t>
-      </w:r>
-      <w:r>
-        <w:t xml:space="preserve"> tự động nhận diện nếu tên trả về dạng mã hex UUID (</w:t>
-      </w:r>
-      <w:r>
-        <w:rPr>
-          <w:rFonts w:ascii="Courier New" w:eastAsia="Courier New" w:hAnsi="Courier New" w:cs="Courier New"/>
-          <w:shd w:val="clear" w:color="auto" w:fill="F1F5F9"/>
-        </w:rPr>
-        <w:t>/^[0-9a-f-]{16,}$/i</w:t>
-      </w:r>
-      <w:r>
-        <w:t>) để thay thế bằng danh xưng tự nhiên: "Đã chọn trên sổ Họ".</w:t>
-      </w:r>
-    </w:p>
-    <w:p>
-      <w:pPr>
-        <w:spacing w:after="200"/>
-      </w:pPr>
-      <w:r>
-        <w:t xml:space="preserve"> </w:t>
-      </w:r>
-    </w:p>
-    <w:p>
-      <w:pPr>
-        <w:pStyle w:val="Heading4"/>
-        <w:spacing w:after="200"/>
-      </w:pPr>
-      <w:r>
-        <w:t>3) Đánh giá chất lượng mã nguồn</w:t>
-      </w:r>
-    </w:p>
-    <w:p>
-      <w:pPr>
-        <w:spacing w:after="200"/>
-      </w:pPr>
-      <w:r>
-        <w:t xml:space="preserve"> </w:t>
-      </w:r>
-    </w:p>
-    <w:p>
-      <w:pPr>
-        <w:pStyle w:val="ListParagraph"/>
-        <w:numPr>
-          <w:ilvl w:val="0"/>
-          <w:numId w:val="2"/>
-        </w:numPr>
-        <w:spacing w:after="100"/>
-      </w:pPr>
-      <w:r>
-        <w:rPr>
-          <w:b/>
-          <w:bCs/>
-        </w:rPr>
-        <w:t>Ưu điểm:</w:t>
-      </w:r>
-      <w:r>
-        <w:t xml:space="preserve"> Giao diện Accordion rất gọn gàng, có nút nghe giọng đọc tóm tắt tiến độ phiếu cực kỳ thân thiện.</w:t>
-      </w:r>
-    </w:p>
-    <w:p>
-      <w:pPr>
-        <w:pStyle w:val="ListParagraph"/>
-        <w:numPr>
-          <w:ilvl w:val="0"/>
-          <w:numId w:val="2"/>
-        </w:numPr>
-        <w:spacing w:after="100"/>
-      </w:pPr>
-      <w:r>
-        <w:rPr>
-          <w:b/>
-          <w:bCs/>
-        </w:rPr>
-        <w:t>Lỗ hổng chết người:</w:t>
-      </w:r>
-    </w:p>
-    <w:p>
-      <w:pPr>
-        <w:pStyle w:val="ListParagraph"/>
-        <w:numPr>
-          <w:ilvl w:val="1"/>
-          <w:numId w:val="2"/>
-        </w:numPr>
-        <w:spacing w:after="100"/>
-      </w:pPr>
-      <w:r>
-        <w:rPr>
-          <w:b/>
-          <w:bCs/>
-        </w:rPr>
-        <w:t>Thiếu Entrypoint vào Workbench:</w:t>
-      </w:r>
-      <w:r>
-        <w:t xml:space="preserve"> Với các phiếu ở trạng thái </w:t>
-      </w:r>
-      <w:r>
-        <w:rPr>
-          <w:rFonts w:ascii="Courier New" w:eastAsia="Courier New" w:hAnsi="Courier New" w:cs="Courier New"/>
-          <w:shd w:val="clear" w:color="auto" w:fill="F1F5F9"/>
-        </w:rPr>
-        <w:t>UNDER_REVIEW</w:t>
-      </w:r>
-      <w:r>
-        <w:t xml:space="preserve"> (đã có tem </w:t>
-      </w:r>
-      <w:r>
-        <w:rPr>
-          <w:rFonts w:ascii="Courier New" w:eastAsia="Courier New" w:hAnsi="Courier New" w:cs="Courier New"/>
-          <w:shd w:val="clear" w:color="auto" w:fill="F1F5F9"/>
-        </w:rPr>
-        <w:t>plan_ok</w:t>
-      </w:r>
-      <w:r>
-        <w:t xml:space="preserve">), component này </w:t>
-      </w:r>
-      <w:r>
-        <w:rPr>
-          <w:b/>
-          <w:bCs/>
-        </w:rPr>
-        <w:t>không có nút bấm nào</w:t>
-      </w:r>
-      <w:r>
-        <w:t xml:space="preserve"> để dẫn người dùng vào trang làm việc (Workbench) để tạo thành viên! Người dùng bị kẹt lại ở màn hình xem trạng thái mà không biết làm sao để nhập người tiếp.</w:t>
-      </w:r>
-    </w:p>
-    <w:p>
-      <w:pPr>
-        <w:pStyle w:val="ListParagraph"/>
-        <w:numPr>
-          <w:ilvl w:val="0"/>
-          <w:numId w:val="2"/>
-        </w:numPr>
-        <w:spacing w:after="100"/>
-      </w:pPr>
-      <w:r>
-        <w:rPr>
-          <w:b/>
-          <w:bCs/>
-        </w:rPr>
-        <w:t>Hướng tối ưu:</w:t>
-      </w:r>
-      <w:r>
-        <w:t xml:space="preserve"> Bổ sung nút CTA lớn: "Vào Xưởng Kê Khai (Workbench)" khi </w:t>
-      </w:r>
-      <w:r>
-        <w:rPr>
-          <w:rFonts w:ascii="Courier New" w:eastAsia="Courier New" w:hAnsi="Courier New" w:cs="Courier New"/>
-          <w:shd w:val="clear" w:color="auto" w:fill="F1F5F9"/>
-        </w:rPr>
-        <w:t>ticket.payload.plan_ok === true</w:t>
-      </w:r>
-      <w:r>
-        <w:t>.</w:t>
-      </w:r>
-    </w:p>
-    <w:p>
-      <w:pPr>
-        <w:spacing w:after="200"/>
-      </w:pPr>
-      <w:r>
-        <w:t xml:space="preserve"> </w:t>
-      </w:r>
-    </w:p>
-    <w:p>
-      <w:pPr>
-        <w:pStyle w:val="Heading3"/>
-        <w:spacing w:after="200"/>
-      </w:pPr>
-      <w:r>
-        <w:t xml:space="preserve">9. FE-09: </w:t>
-      </w:r>
-      <w:r>
-        <w:rPr>
-          <w:rFonts w:ascii="Courier New" w:eastAsia="Courier New" w:hAnsi="Courier New" w:cs="Courier New"/>
-          <w:shd w:val="clear" w:color="auto" w:fill="F1F5F9"/>
-        </w:rPr>
-        <w:t>frontend/src/pages/OpHubPage.jsx</w:t>
-      </w:r>
-    </w:p>
-    <w:p>
-      <w:pPr>
-        <w:spacing w:after="200"/>
-      </w:pPr>
-      <w:r>
-        <w:t xml:space="preserve"> </w:t>
-      </w:r>
-    </w:p>
-    <w:p>
-      <w:pPr>
-        <w:pStyle w:val="Heading4"/>
-        <w:spacing w:after="200"/>
-      </w:pPr>
-      <w:r>
-        <w:t>1) Nội dung</w:t>
-      </w:r>
-    </w:p>
-    <w:p>
-      <w:pPr>
-        <w:spacing w:after="200"/>
-      </w:pPr>
-      <w:r>
-        <w:t xml:space="preserve"> </w:t>
-      </w:r>
-    </w:p>
-    <w:p>
-      <w:pPr>
-        <w:pStyle w:val="ListParagraph"/>
-        <w:numPr>
-          <w:ilvl w:val="0"/>
-          <w:numId w:val="2"/>
-        </w:numPr>
-        <w:spacing w:after="100"/>
-      </w:pPr>
-      <w:r>
-        <w:rPr>
-          <w:b/>
-          <w:bCs/>
-        </w:rPr>
-        <w:t>Chức năng:</w:t>
-      </w:r>
-      <w:r>
-        <w:t xml:space="preserve"> Cổng tác nghiệp chính (</w:t>
-      </w:r>
-      <w:r>
-        <w:rPr>
-          <w:rFonts w:ascii="Courier New" w:eastAsia="Courier New" w:hAnsi="Courier New" w:cs="Courier New"/>
-          <w:shd w:val="clear" w:color="auto" w:fill="F1F5F9"/>
-        </w:rPr>
-        <w:t>/op</w:t>
-      </w:r>
-      <w:r>
-        <w:t>) của thành viên đã đăng nhập (MWL).</w:t>
-      </w:r>
-    </w:p>
-    <w:p>
-      <w:pPr>
-        <w:pStyle w:val="ListParagraph"/>
-        <w:numPr>
-          <w:ilvl w:val="0"/>
-          <w:numId w:val="2"/>
-        </w:numPr>
-        <w:spacing w:after="100"/>
-      </w:pPr>
-      <w:r>
-        <w:rPr>
-          <w:b/>
-          <w:bCs/>
-        </w:rPr>
-        <w:t>Nhiệm vụ:</w:t>
-      </w:r>
-    </w:p>
-    <w:p>
-      <w:pPr>
-        <w:pStyle w:val="ListParagraph"/>
-        <w:numPr>
-          <w:ilvl w:val="1"/>
-          <w:numId w:val="2"/>
-        </w:numPr>
-        <w:spacing w:after="100"/>
-      </w:pPr>
-      <w:r>
-        <w:t xml:space="preserve">Nhúng component </w:t>
-      </w:r>
-      <w:r>
-        <w:rPr>
-          <w:rFonts w:ascii="Courier New" w:eastAsia="Courier New" w:hAnsi="Courier New" w:cs="Courier New"/>
-          <w:shd w:val="clear" w:color="auto" w:fill="F1F5F9"/>
-        </w:rPr>
-        <w:t>MyMfoPlans</w:t>
-      </w:r>
-      <w:r>
-        <w:t xml:space="preserve"> làm khu vực tác nghiệp ưu tiên trên cùng.</w:t>
-      </w:r>
-    </w:p>
-    <w:p>
-      <w:pPr>
-        <w:pStyle w:val="ListParagraph"/>
-        <w:numPr>
-          <w:ilvl w:val="1"/>
-          <w:numId w:val="2"/>
-        </w:numPr>
-        <w:spacing w:after="100"/>
-      </w:pPr>
-      <w:r>
-        <w:t>Điều phối các chức năng hồ sơ cá nhân: Họ tên, Ngày sinh, Địa chỉ, Tiểu sử, Thành tựu.</w:t>
-      </w:r>
-    </w:p>
-    <w:p>
-      <w:pPr>
-        <w:pStyle w:val="ListParagraph"/>
-        <w:numPr>
-          <w:ilvl w:val="1"/>
-          <w:numId w:val="2"/>
-        </w:numPr>
-        <w:spacing w:after="100"/>
-      </w:pPr>
-      <w:r>
-        <w:t xml:space="preserve">Bảo vệ trạng thái Onboarding: Chặn các tài khoản </w:t>
-      </w:r>
-      <w:r>
-        <w:rPr>
-          <w:rFonts w:ascii="Courier New" w:eastAsia="Courier New" w:hAnsi="Courier New" w:cs="Courier New"/>
-          <w:shd w:val="clear" w:color="auto" w:fill="F1F5F9"/>
-        </w:rPr>
-        <w:t>DU_BI</w:t>
-      </w:r>
-      <w:r>
-        <w:t xml:space="preserve"> chưa hoàn tất hồ sơ không được vào sâu hệ thống.</w:t>
-      </w:r>
-    </w:p>
-    <w:p>
-      <w:pPr>
-        <w:spacing w:after="200"/>
-      </w:pPr>
-      <w:r>
-        <w:t xml:space="preserve"> </w:t>
-      </w:r>
-    </w:p>
-    <w:p>
-      <w:pPr>
-        <w:pStyle w:val="Heading4"/>
-        <w:spacing w:after="200"/>
-      </w:pPr>
-      <w:r>
-        <w:t>2) Đánh giá chất lượng mã nguồn</w:t>
-      </w:r>
-    </w:p>
-    <w:p>
-      <w:pPr>
-        <w:spacing w:after="200"/>
-      </w:pPr>
-      <w:r>
-        <w:t xml:space="preserve"> </w:t>
-      </w:r>
-    </w:p>
-    <w:p>
-      <w:pPr>
-        <w:pStyle w:val="ListParagraph"/>
-        <w:numPr>
-          <w:ilvl w:val="0"/>
-          <w:numId w:val="2"/>
-        </w:numPr>
-        <w:spacing w:after="100"/>
-      </w:pPr>
-      <w:r>
-        <w:rPr>
-          <w:b/>
-          <w:bCs/>
-        </w:rPr>
-        <w:t>Ưu điểm:</w:t>
-      </w:r>
-      <w:r>
-        <w:t xml:space="preserve"> Tích hợp đa năng, kiểm soát phiên đăng nhập và định danh chi họ (</w:t>
-      </w:r>
-      <w:r>
-        <w:rPr>
-          <w:rFonts w:ascii="Courier New" w:eastAsia="Courier New" w:hAnsi="Courier New" w:cs="Courier New"/>
-          <w:shd w:val="clear" w:color="auto" w:fill="F1F5F9"/>
-        </w:rPr>
-        <w:t>resolveTenant</w:t>
-      </w:r>
-      <w:r>
-        <w:t>) rất chặt chẽ.</w:t>
-      </w:r>
-    </w:p>
-    <w:p>
-      <w:pPr>
-        <w:pStyle w:val="ListParagraph"/>
-        <w:numPr>
-          <w:ilvl w:val="0"/>
-          <w:numId w:val="2"/>
-        </w:numPr>
-        <w:spacing w:after="100"/>
-      </w:pPr>
-      <w:r>
-        <w:rPr>
-          <w:b/>
-          <w:bCs/>
-        </w:rPr>
-        <w:t>Điểm nghẽn liên quan đến MFO:</w:t>
-      </w:r>
-    </w:p>
-    <w:p>
-      <w:pPr>
-        <w:pStyle w:val="ListParagraph"/>
-        <w:numPr>
-          <w:ilvl w:val="1"/>
-          <w:numId w:val="2"/>
-        </w:numPr>
-        <w:spacing w:after="100"/>
-      </w:pPr>
-      <w:r>
         <w:t>Hiện tại Hub đang để tính năng MFO nằm chung trong một trang dài cùng với toàn bộ form Profile cá nhân (</w:t>
       </w:r>
       <w:r>
@@ -5658,7 +5674,6 @@
         <w:spacing w:after="200"/>
       </w:pPr>
       <w:r>
-        <w:lastRenderedPageBreak/>
         <w:t xml:space="preserve"> </w:t>
       </w:r>
     </w:p>
@@ -6190,7 +6205,11 @@
         <w:t>reactflow</w:t>
       </w:r>
       <w:r>
-        <w:t xml:space="preserve">, Pan/Zoom Camera Canvas. | Dùng DOM HTML, Tailwind Flex/Grid, </w:t>
+        <w:t xml:space="preserve">, Pan/Zoom Camera Canvas. | Dùng DOM </w:t>
+      </w:r>
+      <w:r>
+        <w:lastRenderedPageBreak/>
+        <w:t xml:space="preserve">HTML, Tailwind Flex/Grid, </w:t>
       </w:r>
       <w:r>
         <w:rPr>
@@ -6251,7 +6270,6 @@
           <w:rFonts w:ascii="Courier New" w:eastAsia="Courier New" w:hAnsi="Courier New" w:cs="Courier New"/>
           <w:shd w:val="clear" w:color="auto" w:fill="F1F5F9"/>
         </w:rPr>
-        <w:lastRenderedPageBreak/>
         <w:t>OpMfoPlanPage.jsx</w:t>
       </w:r>
       <w:r>
@@ -6800,6 +6818,7 @@
         <w:spacing w:after="200"/>
       </w:pPr>
       <w:r>
+        <w:lastRenderedPageBreak/>
         <w:t xml:space="preserve">Bước 4: Mở nút điều hướng trên </w:t>
       </w:r>
       <w:r>
@@ -6815,7 +6834,6 @@
         <w:spacing w:after="200"/>
       </w:pPr>
       <w:r>
-        <w:lastRenderedPageBreak/>
         <w:t xml:space="preserve"> </w:t>
       </w:r>
     </w:p>

</xml_diff>